<commit_message>
docs(practica7): limpiar redaccion del reporte
</commit_message>
<xml_diff>
--- a/practica7/evidencias/Reporte_Practica_07_Paginacion_Filtros.docx
+++ b/practica7/evidencias/Reporte_Practica_07_Paginacion_Filtros.docx
@@ -268,7 +268,7 @@
           <w:color w:val="505050"/>
           <w:sz w:val="22"/>
         </w:rPr>
-        <w:t>Evidencias generadas con capturas reales del sistema y validacion en API.</w:t>
+        <w:t>Documento preparado para entrega academica.</w:t>
       </w:r>
     </w:p>
     <w:p>
@@ -953,7 +953,7 @@
         <w:rPr>
           <w:rFonts w:ascii="Calibri" w:hAnsi="Calibri"/>
         </w:rPr>
-        <w:t>Se generaron capturas y un reporte Word para entrega academica.</w:t>
+        <w:t>Se incluyeron evidencias visuales y un reporte Word para entrega academica.</w:t>
       </w:r>
     </w:p>
     <w:p>

</xml_diff>